<commit_message>
Detailed update of software description and user manual
- Rewrite user manual from scratch: 13 detailed sections with step-by-step
  workflows, two-step import/trace, detector window + DTS playback, random
  vibration multivariate sampling, expanded troubleshooting table; embed
  current light-theme screenshots.
- Enrich software description: dependency-impact table; full rigid-body
  derivation (translation decoupling, trace maximization, reflection
  protection, rotation vector), closed-form residual, degenerate case.
- Regenerate both .docx.

Co-Authored-By: Claude Opus 4.8 <noreply@anthropic.com>
</commit_message>
<xml_diff>
--- a/docs/Windows端软件说明.docx
+++ b/docs/Windows端软件说明.docx
@@ -1065,61 +1065,7 @@
         <w:rPr>
           <w:rFonts w:hint="eastAsia"/>
         </w:rPr>
-        <w:t xml:space="preserve">软件依赖</w:t>
-      </w:r>
-      <w:r>
-        <w:t xml:space="preserve"> PySide6、ansys-mechanical-core、pythonnet、numpy </w:t>
-      </w:r>
-      <w:r>
-        <w:rPr>
-          <w:rFonts w:hint="eastAsia"/>
-        </w:rPr>
-        <w:t xml:space="preserve">和</w:t>
-      </w:r>
-      <w:r>
-        <w:t xml:space="preserve"> </w:t>
-      </w:r>
-      <w:r>
-        <w:rPr>
-          <w:rFonts w:hint="eastAsia"/>
-        </w:rPr>
-        <w:t xml:space="preserve">scipy。其中</w:t>
-      </w:r>
-      <w:r>
-        <w:t xml:space="preserve"> numpy </w:t>
-      </w:r>
-      <w:r>
-        <w:rPr>
-          <w:rFonts w:hint="eastAsia"/>
-        </w:rPr>
-        <w:t xml:space="preserve">用于刚体配准与多元正态采样，scipy</w:t>
-      </w:r>
-      <w:r>
-        <w:t xml:space="preserve"> </w:t>
-      </w:r>
-      <w:r>
-        <w:rPr>
-          <w:rFonts w:hint="eastAsia"/>
-        </w:rPr>
-        <w:t xml:space="preserve">用于把探测器矩阵导出为</w:t>
-      </w:r>
-      <w:r>
-        <w:t xml:space="preserve"> MATLAB</w:t>
-      </w:r>
-      <w:r>
-        <w:t xml:space="preserve"> </w:t>
-      </w:r>
-      <w:r>
-        <w:rPr>
-          <w:rStyle w:val="VerbatimChar"/>
-        </w:rPr>
-        <w:t xml:space="preserve">.mat</w:t>
-      </w:r>
-      <w:r>
-        <w:rPr>
-          <w:rFonts w:hint="eastAsia"/>
-        </w:rPr>
-        <w:t xml:space="preserve">，缺少时相关功能会回退或不可用。从源码运行时，建议使用</w:t>
+        <w:t xml:space="preserve">软件的</w:t>
       </w:r>
       <w:r>
         <w:t xml:space="preserve"> Python </w:t>
@@ -1128,6 +1074,339 @@
         <w:rPr>
           <w:rFonts w:hint="eastAsia"/>
         </w:rPr>
+        <w:t xml:space="preserve">依赖及其用途、缺失影响如下：</w:t>
+      </w:r>
+    </w:p>
+    <w:tbl>
+      <w:tblPr>
+        <w:tblStyle w:val="Table"/>
+        <w:tblW w:type="pct" w:w="5000"/>
+        <w:tblLayout w:type="fixed"/>
+        <w:tblLook w:firstRow="1" w:lastRow="0" w:firstColumn="0" w:lastColumn="0" w:noHBand="0" w:noVBand="0" w:val="0020"/>
+      </w:tblPr>
+      <w:tblGrid>
+        <w:gridCol w:w="2160"/>
+        <w:gridCol w:w="2160"/>
+        <w:gridCol w:w="3600"/>
+      </w:tblGrid>
+      <w:tr>
+        <w:trPr>
+          <w:tblHeader w:val="on"/>
+        </w:trPr>
+        <w:tc>
+          <w:tcPr/>
+          <w:p>
+            <w:pPr>
+              <w:pStyle w:val="Compact"/>
+            </w:pPr>
+            <w:r>
+              <w:rPr>
+                <w:rFonts w:hint="eastAsia"/>
+              </w:rPr>
+              <w:t xml:space="preserve">依赖</w:t>
+            </w:r>
+          </w:p>
+        </w:tc>
+        <w:tc>
+          <w:tcPr/>
+          <w:p>
+            <w:pPr>
+              <w:pStyle w:val="Compact"/>
+            </w:pPr>
+            <w:r>
+              <w:rPr>
+                <w:rFonts w:hint="eastAsia"/>
+              </w:rPr>
+              <w:t xml:space="preserve">用途</w:t>
+            </w:r>
+          </w:p>
+        </w:tc>
+        <w:tc>
+          <w:tcPr/>
+          <w:p>
+            <w:pPr>
+              <w:pStyle w:val="Compact"/>
+            </w:pPr>
+            <w:r>
+              <w:rPr>
+                <w:rFonts w:hint="eastAsia"/>
+              </w:rPr>
+              <w:t xml:space="preserve">缺失影响</w:t>
+            </w:r>
+          </w:p>
+        </w:tc>
+      </w:tr>
+      <w:tr>
+        <w:tc>
+          <w:tcPr/>
+          <w:p>
+            <w:pPr>
+              <w:pStyle w:val="Compact"/>
+            </w:pPr>
+            <w:r>
+              <w:t xml:space="preserve">PySide6</w:t>
+            </w:r>
+          </w:p>
+        </w:tc>
+        <w:tc>
+          <w:tcPr/>
+          <w:p>
+            <w:pPr>
+              <w:pStyle w:val="Compact"/>
+            </w:pPr>
+            <w:r>
+              <w:rPr>
+                <w:rFonts w:hint="eastAsia"/>
+              </w:rPr>
+              <w:t xml:space="preserve">桌面界面</w:t>
+            </w:r>
+          </w:p>
+        </w:tc>
+        <w:tc>
+          <w:tcPr/>
+          <w:p>
+            <w:pPr>
+              <w:pStyle w:val="Compact"/>
+            </w:pPr>
+            <w:r>
+              <w:rPr>
+                <w:rFonts w:hint="eastAsia"/>
+              </w:rPr>
+              <w:t xml:space="preserve">软件无法启动</w:t>
+            </w:r>
+          </w:p>
+        </w:tc>
+      </w:tr>
+      <w:tr>
+        <w:tc>
+          <w:tcPr/>
+          <w:p>
+            <w:pPr>
+              <w:pStyle w:val="Compact"/>
+            </w:pPr>
+            <w:r>
+              <w:t xml:space="preserve">ansys-mechanical-core</w:t>
+            </w:r>
+          </w:p>
+        </w:tc>
+        <w:tc>
+          <w:tcPr/>
+          <w:p>
+            <w:pPr>
+              <w:pStyle w:val="Compact"/>
+            </w:pPr>
+            <w:r>
+              <w:t xml:space="preserve">PyMechanical </w:t>
+            </w:r>
+            <w:r>
+              <w:rPr>
+                <w:rFonts w:hint="eastAsia"/>
+              </w:rPr>
+              <w:t xml:space="preserve">连接</w:t>
+            </w:r>
+            <w:r>
+              <w:t xml:space="preserve"> Mechanical</w:t>
+            </w:r>
+          </w:p>
+        </w:tc>
+        <w:tc>
+          <w:tcPr/>
+          <w:p>
+            <w:pPr>
+              <w:pStyle w:val="Compact"/>
+            </w:pPr>
+            <w:r>
+              <w:t xml:space="preserve">Mechanical </w:t>
+            </w:r>
+            <w:r>
+              <w:rPr>
+                <w:rFonts w:hint="eastAsia"/>
+              </w:rPr>
+              <w:t xml:space="preserve">相关功能不可用</w:t>
+            </w:r>
+          </w:p>
+        </w:tc>
+      </w:tr>
+      <w:tr>
+        <w:tc>
+          <w:tcPr/>
+          <w:p>
+            <w:pPr>
+              <w:pStyle w:val="Compact"/>
+            </w:pPr>
+            <w:r>
+              <w:t xml:space="preserve">pythonnet</w:t>
+            </w:r>
+          </w:p>
+        </w:tc>
+        <w:tc>
+          <w:tcPr/>
+          <w:p>
+            <w:pPr>
+              <w:pStyle w:val="Compact"/>
+            </w:pPr>
+            <w:r>
+              <w:t xml:space="preserve">ZOS-API </w:t>
+            </w:r>
+            <w:r>
+              <w:rPr>
+                <w:rFonts w:hint="eastAsia"/>
+              </w:rPr>
+              <w:t xml:space="preserve">调用</w:t>
+            </w:r>
+            <w:r>
+              <w:t xml:space="preserve"> Zemax</w:t>
+            </w:r>
+          </w:p>
+        </w:tc>
+        <w:tc>
+          <w:tcPr/>
+          <w:p>
+            <w:pPr>
+              <w:pStyle w:val="Compact"/>
+            </w:pPr>
+            <w:r>
+              <w:t xml:space="preserve">Zemax </w:t>
+            </w:r>
+            <w:r>
+              <w:rPr>
+                <w:rFonts w:hint="eastAsia"/>
+              </w:rPr>
+              <w:t xml:space="preserve">相关功能不可用</w:t>
+            </w:r>
+          </w:p>
+        </w:tc>
+      </w:tr>
+      <w:tr>
+        <w:tc>
+          <w:tcPr/>
+          <w:p>
+            <w:pPr>
+              <w:pStyle w:val="Compact"/>
+            </w:pPr>
+            <w:r>
+              <w:t xml:space="preserve">numpy</w:t>
+            </w:r>
+          </w:p>
+        </w:tc>
+        <w:tc>
+          <w:tcPr/>
+          <w:p>
+            <w:pPr>
+              <w:pStyle w:val="Compact"/>
+            </w:pPr>
+            <w:r>
+              <w:rPr>
+                <w:rFonts w:hint="eastAsia"/>
+              </w:rPr>
+              <w:t xml:space="preserve">刚体配准（SVD/Kabsch）、多元正态采样</w:t>
+            </w:r>
+          </w:p>
+        </w:tc>
+        <w:tc>
+          <w:tcPr/>
+          <w:p>
+            <w:pPr>
+              <w:pStyle w:val="Compact"/>
+            </w:pPr>
+            <w:r>
+              <w:rPr>
+                <w:rFonts w:hint="eastAsia"/>
+              </w:rPr>
+              <w:t xml:space="preserve">旋转拟合回退小角度、随机振动相关性不可用</w:t>
+            </w:r>
+          </w:p>
+        </w:tc>
+      </w:tr>
+      <w:tr>
+        <w:tc>
+          <w:tcPr/>
+          <w:p>
+            <w:pPr>
+              <w:pStyle w:val="Compact"/>
+            </w:pPr>
+            <w:r>
+              <w:t xml:space="preserve">scipy</w:t>
+            </w:r>
+          </w:p>
+        </w:tc>
+        <w:tc>
+          <w:tcPr/>
+          <w:p>
+            <w:pPr>
+              <w:pStyle w:val="Compact"/>
+            </w:pPr>
+            <w:r>
+              <w:rPr>
+                <w:rFonts w:hint="eastAsia"/>
+              </w:rPr>
+              <w:t xml:space="preserve">探测器导出</w:t>
+            </w:r>
+            <w:r>
+              <w:t xml:space="preserve"> MATLAB</w:t>
+            </w:r>
+            <w:r>
+              <w:t xml:space="preserve"> </w:t>
+            </w:r>
+            <w:r>
+              <w:rPr>
+                <w:rStyle w:val="VerbatimChar"/>
+              </w:rPr>
+              <w:t xml:space="preserve">.mat</w:t>
+            </w:r>
+          </w:p>
+        </w:tc>
+        <w:tc>
+          <w:tcPr/>
+          <w:p>
+            <w:pPr>
+              <w:pStyle w:val="Compact"/>
+            </w:pPr>
+            <w:r>
+              <w:rPr>
+                <w:rFonts w:hint="eastAsia"/>
+              </w:rPr>
+              <w:t xml:space="preserve">「完整导出MATLAB」不可用</w:t>
+            </w:r>
+          </w:p>
+        </w:tc>
+      </w:tr>
+    </w:tbl>
+    <w:p>
+      <w:pPr>
+        <w:pStyle w:val="BodyText"/>
+      </w:pPr>
+      <w:r>
+        <w:rPr>
+          <w:rFonts w:hint="eastAsia"/>
+        </w:rPr>
+        <w:t xml:space="preserve">安装包会把上述依赖与</w:t>
+      </w:r>
+      <w:r>
+        <w:t xml:space="preserve"> Python </w:t>
+      </w:r>
+      <w:r>
+        <w:rPr>
+          <w:rFonts w:hint="eastAsia"/>
+        </w:rPr>
+        <w:t xml:space="preserve">运行时一起打包，目标机无需单独安装</w:t>
+      </w:r>
+      <w:r>
+        <w:t xml:space="preserve"> </w:t>
+      </w:r>
+      <w:r>
+        <w:rPr>
+          <w:rFonts w:hint="eastAsia"/>
+        </w:rPr>
+        <w:t xml:space="preserve">Anaconda。从源码运行时，建议使用</w:t>
+      </w:r>
+      <w:r>
+        <w:t xml:space="preserve"> Python </w:t>
+      </w:r>
+      <w:r>
+        <w:rPr>
+          <w:rFonts w:hint="eastAsia"/>
+        </w:rPr>
         <w:t xml:space="preserve">环境</w:t>
       </w:r>
       <w:r>
@@ -1171,7 +1450,22 @@
         <w:rPr>
           <w:rFonts w:hint="eastAsia"/>
         </w:rPr>
-        <w:t xml:space="preserve">）：</w:t>
+        <w:t xml:space="preserve">）；</w:t>
+      </w:r>
+      <w:r>
+        <w:rPr>
+          <w:rStyle w:val="VerbatimChar"/>
+        </w:rPr>
+        <w:t xml:space="preserve">check_environment.py</w:t>
+      </w:r>
+      <w:r>
+        <w:t xml:space="preserve"> </w:t>
+      </w:r>
+      <w:r>
+        <w:rPr>
+          <w:rFonts w:hint="eastAsia"/>
+        </w:rPr>
+        <w:t xml:space="preserve">会逐项报告这些依赖与四个关键可执行文件路径是否就绪：</w:t>
       </w:r>
     </w:p>
     <w:p>
@@ -2011,16 +2305,85 @@
         <w:rPr>
           <w:rFonts w:hint="eastAsia"/>
         </w:rPr>
-        <w:t xml:space="preserve">给出节点级位移，Zemax</w:t>
-      </w:r>
-      <w:r>
-        <w:t xml:space="preserve"> </w:t>
-      </w:r>
-      <w:r>
-        <w:rPr>
-          <w:rFonts w:hint="eastAsia"/>
-        </w:rPr>
-        <w:t xml:space="preserve">非序列对象需要的是元件的整体刚体位移/旋转——横向偏心（decenter）、沿光轴离焦（despace）与倾斜（tilt）。软件把某镜片对应的一组节点当作刚体点云做配准：</w:t>
+        <w:t xml:space="preserve">给出节点级位移</w:t>
+      </w:r>
+      <w:r>
+        <w:t xml:space="preserve"> </w:t>
+      </w:r>
+      <w:r>
+        <w:rPr>
+          <w:rStyle w:val="VerbatimChar"/>
+        </w:rPr>
+        <w:t xml:space="preserve">uᵢ</w:t>
+      </w:r>
+      <w:r>
+        <w:rPr>
+          <w:rFonts w:hint="eastAsia"/>
+        </w:rPr>
+        <w:t xml:space="preserve">，Zemax</w:t>
+      </w:r>
+      <w:r>
+        <w:t xml:space="preserve"> </w:t>
+      </w:r>
+      <w:r>
+        <w:rPr>
+          <w:rFonts w:hint="eastAsia"/>
+        </w:rPr>
+        <w:t xml:space="preserve">非序列对象需要的是元件的整体刚体位移/旋转——横向偏心（decenter）、沿光轴离焦（despace）与倾斜（tilt）。软件把某镜片对应的一组节点当作刚体点云，求一个刚体变换</w:t>
+      </w:r>
+      <w:r>
+        <w:t xml:space="preserve"> </w:t>
+      </w:r>
+      <w:r>
+        <w:rPr>
+          <w:rStyle w:val="VerbatimChar"/>
+        </w:rPr>
+        <w:t xml:space="preserve">qᵢ ≈ R·pᵢ + t</w:t>
+      </w:r>
+      <w:r>
+        <w:rPr>
+          <w:rFonts w:hint="eastAsia"/>
+        </w:rPr>
+        <w:t xml:space="preserve">（</w:t>
+      </w:r>
+      <w:r>
+        <w:rPr>
+          <w:rStyle w:val="VerbatimChar"/>
+        </w:rPr>
+        <w:t xml:space="preserve">pᵢ</w:t>
+      </w:r>
+      <w:r>
+        <w:t xml:space="preserve"> </w:t>
+      </w:r>
+      <w:r>
+        <w:rPr>
+          <w:rFonts w:hint="eastAsia"/>
+        </w:rPr>
+        <w:t xml:space="preserve">原始坐标、</w:t>
+      </w:r>
+      <w:r>
+        <w:rPr>
+          <w:rStyle w:val="VerbatimChar"/>
+        </w:rPr>
+        <w:t xml:space="preserve">qᵢ = pᵢ + uᵢ</w:t>
+      </w:r>
+      <w:r>
+        <w:t xml:space="preserve"> </w:t>
+      </w:r>
+      <w:r>
+        <w:rPr>
+          <w:rFonts w:hint="eastAsia"/>
+        </w:rPr>
+        <w:t xml:space="preserve">变形后坐标）使其逼近所有节点的实际变形。这在数学上是带正交约束的最小二乘（正交</w:t>
+      </w:r>
+      <w:r>
+        <w:t xml:space="preserve"> Procrustes / </w:t>
+      </w:r>
+      <w:r>
+        <w:rPr>
+          <w:rFonts w:hint="eastAsia"/>
+        </w:rPr>
+        <w:t xml:space="preserve">Kabsch）问题：</w:t>
       </w:r>
     </w:p>
     <w:p>
@@ -2041,9 +2404,49 @@
       </w:r>
       <w:r>
         <w:rPr>
-          <w:rFonts w:hint="eastAsia"/>
-        </w:rPr>
-        <w:t xml:space="preserve">取所有节点位移的均值（质心位移），横向分量即偏心、沿光轴分量即离焦。</w:t>
+          <w:b/>
+          <w:bCs/>
+        </w:rPr>
+        <w:t xml:space="preserve"> t</w:t>
+      </w:r>
+      <w:r>
+        <w:rPr>
+          <w:rFonts w:hint="eastAsia"/>
+        </w:rPr>
+        <w:t xml:space="preserve">：固定</w:t>
+      </w:r>
+      <w:r>
+        <w:t xml:space="preserve"> R </w:t>
+      </w:r>
+      <w:r>
+        <w:rPr>
+          <w:rFonts w:hint="eastAsia"/>
+        </w:rPr>
+        <w:t xml:space="preserve">对</w:t>
+      </w:r>
+      <w:r>
+        <w:t xml:space="preserve"> t </w:t>
+      </w:r>
+      <w:r>
+        <w:rPr>
+          <w:rFonts w:hint="eastAsia"/>
+        </w:rPr>
+        <w:t xml:space="preserve">求极值得</w:t>
+      </w:r>
+      <w:r>
+        <w:t xml:space="preserve"> </w:t>
+      </w:r>
+      <w:r>
+        <w:rPr>
+          <w:rStyle w:val="VerbatimChar"/>
+        </w:rPr>
+        <w:t xml:space="preserve">t = q̄ − R·p̄</w:t>
+      </w:r>
+      <w:r>
+        <w:rPr>
+          <w:rFonts w:hint="eastAsia"/>
+        </w:rPr>
+        <w:t xml:space="preserve">（变形前后质心之差），物理上即把原始质心旋转后对齐到变形后质心。横向分量即偏心、沿光轴分量即离焦。代回后目标函数只剩纯旋转项，这就是「先质心平移、再绕质心拟合旋转」的依据。</w:t>
       </w:r>
     </w:p>
     <w:p>
@@ -2064,18 +2467,91 @@
       </w:r>
       <w:r>
         <w:rPr>
-          <w:rFonts w:hint="eastAsia"/>
-        </w:rPr>
-        <w:t xml:space="preserve">默认用</w:t>
-      </w:r>
-      <w:r>
-        <w:t xml:space="preserve"> SVD/Kabsch </w:t>
-      </w:r>
-      <w:r>
-        <w:rPr>
-          <w:rFonts w:hint="eastAsia"/>
-        </w:rPr>
-        <w:t xml:space="preserve">严格刚体配准：</w:t>
+          <w:b/>
+          <w:bCs/>
+        </w:rPr>
+        <w:t xml:space="preserve"> R</w:t>
+      </w:r>
+      <w:r>
+        <w:rPr>
+          <w:rFonts w:hint="eastAsia"/>
+        </w:rPr>
+        <w:t xml:space="preserve">：去质心后，最小化</w:t>
+      </w:r>
+      <w:r>
+        <w:t xml:space="preserve"> </w:t>
+      </w:r>
+      <w:r>
+        <w:rPr>
+          <w:rStyle w:val="VerbatimChar"/>
+        </w:rPr>
+        <w:t xml:space="preserve">Σ‖Qᵢ − R·Pᵢ‖²</w:t>
+      </w:r>
+      <w:r>
+        <w:t xml:space="preserve"> </w:t>
+      </w:r>
+      <w:r>
+        <w:rPr>
+          <w:rFonts w:hint="eastAsia"/>
+        </w:rPr>
+        <w:t xml:space="preserve">等价于最大化</w:t>
+      </w:r>
+      <w:r>
+        <w:t xml:space="preserve"> </w:t>
+      </w:r>
+      <w:r>
+        <w:rPr>
+          <w:rStyle w:val="VerbatimChar"/>
+        </w:rPr>
+        <w:t xml:space="preserve">tr(R·H)</w:t>
+      </w:r>
+      <w:r>
+        <w:rPr>
+          <w:rFonts w:hint="eastAsia"/>
+        </w:rPr>
+        <w:t xml:space="preserve">，其中相关矩阵</w:t>
+      </w:r>
+      <w:r>
+        <w:t xml:space="preserve"> </w:t>
+      </w:r>
+      <w:r>
+        <w:rPr>
+          <w:rStyle w:val="VerbatimChar"/>
+        </w:rPr>
+        <w:t xml:space="preserve">H = Σ Pᵢ Qᵢᵀ</w:t>
+      </w:r>
+      <w:r>
+        <w:rPr>
+          <w:rFonts w:hint="eastAsia"/>
+        </w:rPr>
+        <w:t xml:space="preserve">。对</w:t>
+      </w:r>
+      <w:r>
+        <w:t xml:space="preserve"> H </w:t>
+      </w:r>
+      <w:r>
+        <w:rPr>
+          <w:rFonts w:hint="eastAsia"/>
+        </w:rPr>
+        <w:t xml:space="preserve">做奇异值分解</w:t>
+      </w:r>
+      <w:r>
+        <w:t xml:space="preserve"> </w:t>
+      </w:r>
+      <w:r>
+        <w:rPr>
+          <w:rStyle w:val="VerbatimChar"/>
+        </w:rPr>
+        <w:t xml:space="preserve">H = U·Σ·Vᵀ</w:t>
+      </w:r>
+      <w:r>
+        <w:rPr>
+          <w:rFonts w:hint="eastAsia"/>
+        </w:rPr>
+        <w:t xml:space="preserve">，最优旋转为</w:t>
+      </w:r>
+      <w:r>
+        <w:t xml:space="preserve"> </w:t>
       </w:r>
       <w:r>
         <w:rPr>
@@ -2084,19 +2560,98 @@
         <w:t xml:space="preserve">R = V·diag(1,1,det(VUᵀ))·Uᵀ</w:t>
       </w:r>
       <w:r>
-        <w:rPr>
-          <w:rFonts w:hint="eastAsia"/>
-        </w:rPr>
-        <w:t xml:space="preserve">，含反射保护以保证为正交旋转（det=+1），再经对数映射转为旋转向量</w:t>
-      </w:r>
-      <w:r>
-        <w:t xml:space="preserve"> </w:t>
-      </w:r>
-      <w:r>
-        <w:rPr>
-          <w:rFonts w:hint="eastAsia"/>
-        </w:rPr>
-        <w:t xml:space="preserve">Rx/Ry/Rz（deg）。对任意大小转角都精确；仅在</w:t>
+        <w:t xml:space="preserve">——</w:t>
+      </w:r>
+      <w:r>
+        <w:rPr>
+          <w:rStyle w:val="VerbatimChar"/>
+        </w:rPr>
+        <w:t xml:space="preserve">det</w:t>
+      </w:r>
+      <w:r>
+        <w:t xml:space="preserve"> </w:t>
+      </w:r>
+      <w:r>
+        <w:rPr>
+          <w:rFonts w:hint="eastAsia"/>
+        </w:rPr>
+        <w:t xml:space="preserve">项为</w:t>
+      </w:r>
+      <w:r>
+        <w:rPr>
+          <w:rFonts w:hint="eastAsia"/>
+          <w:b/>
+          <w:bCs/>
+        </w:rPr>
+        <w:t xml:space="preserve">反射保护</w:t>
+      </w:r>
+      <w:r>
+        <w:rPr>
+          <w:rFonts w:hint="eastAsia"/>
+        </w:rPr>
+        <w:t xml:space="preserve">，当</w:t>
+      </w:r>
+      <w:r>
+        <w:t xml:space="preserve"> </w:t>
+      </w:r>
+      <w:r>
+        <w:rPr>
+          <w:rStyle w:val="VerbatimChar"/>
+        </w:rPr>
+        <w:t xml:space="preserve">det(VUᵀ) = −1</w:t>
+      </w:r>
+      <w:r>
+        <w:t xml:space="preserve"> </w:t>
+      </w:r>
+      <w:r>
+        <w:rPr>
+          <w:rFonts w:hint="eastAsia"/>
+        </w:rPr>
+        <w:t xml:space="preserve">时翻转最小奇异值方向以保证</w:t>
+      </w:r>
+      <w:r>
+        <w:t xml:space="preserve"> </w:t>
+      </w:r>
+      <w:r>
+        <w:rPr>
+          <w:rStyle w:val="VerbatimChar"/>
+        </w:rPr>
+        <w:t xml:space="preserve">R</w:t>
+      </w:r>
+      <w:r>
+        <w:t xml:space="preserve"> </w:t>
+      </w:r>
+      <w:r>
+        <w:rPr>
+          <w:rFonts w:hint="eastAsia"/>
+        </w:rPr>
+        <w:t xml:space="preserve">为真旋转（det=+1）而非镜像，且该翻转代价最小。随后把</w:t>
+      </w:r>
+      <w:r>
+        <w:t xml:space="preserve"> R </w:t>
+      </w:r>
+      <w:r>
+        <w:rPr>
+          <w:rFonts w:hint="eastAsia"/>
+        </w:rPr>
+        <w:t xml:space="preserve">经矩阵对数/轴角映射转为</w:t>
+      </w:r>
+      <w:r>
+        <w:rPr>
+          <w:rFonts w:hint="eastAsia"/>
+          <w:b/>
+          <w:bCs/>
+        </w:rPr>
+        <w:t xml:space="preserve">旋转向量</w:t>
+      </w:r>
+      <w:r>
+        <w:t xml:space="preserve"> </w:t>
+      </w:r>
+      <w:r>
+        <w:rPr>
+          <w:rFonts w:hint="eastAsia"/>
+        </w:rPr>
+        <w:t xml:space="preserve">Rx/Ry/Rz（deg）。该解对任意大小转角都精确；仅在</w:t>
       </w:r>
       <w:r>
         <w:t xml:space="preserve"> numpy </w:t>
@@ -2105,7 +2660,16 @@
         <w:rPr>
           <w:rFonts w:hint="eastAsia"/>
         </w:rPr>
-        <w:t xml:space="preserve">不可用或有效节点过少时回退线性化小角度解。</w:t>
+        <w:t xml:space="preserve">不可用、有效节点少于</w:t>
+      </w:r>
+      <w:r>
+        <w:t xml:space="preserve"> 3 </w:t>
+      </w:r>
+      <w:r>
+        <w:rPr>
+          <w:rFonts w:hint="eastAsia"/>
+        </w:rPr>
+        <w:t xml:space="preserve">或数值异常时回退线性化小角度解。</w:t>
       </w:r>
     </w:p>
     <w:p>
@@ -2135,16 +2699,52 @@
         <w:rPr>
           <w:rFonts w:hint="eastAsia"/>
         </w:rPr>
-        <w:t xml:space="preserve">：去除最佳刚体平移+旋转后各节点的剩余位移</w:t>
-      </w:r>
-      <w:r>
-        <w:t xml:space="preserve"> </w:t>
-      </w:r>
-      <w:r>
-        <w:rPr>
-          <w:rFonts w:hint="eastAsia"/>
-        </w:rPr>
-        <w:t xml:space="preserve">RMS，用于衡量该镜片偏离纯刚体的程度。残差越大，说明面形变化越显著、单一刚体位移/旋转越不足以描述真实变形——此时应考虑面形传递（STAR</w:t>
+        <w:t xml:space="preserve">：</w:t>
+      </w:r>
+      <w:r>
+        <w:rPr>
+          <w:rStyle w:val="VerbatimChar"/>
+        </w:rPr>
+        <w:t xml:space="preserve">RMS = sqrt( (1/n) Σ‖qᵢ − (R·pᵢ + t)‖² )</w:t>
+      </w:r>
+      <w:r>
+        <w:rPr>
+          <w:rFonts w:hint="eastAsia"/>
+        </w:rPr>
+        <w:t xml:space="preserve">，即去除最佳刚体平移+旋转后各节点剩余位移的</w:t>
+      </w:r>
+      <w:r>
+        <w:t xml:space="preserve"> </w:t>
+      </w:r>
+      <w:r>
+        <w:rPr>
+          <w:rFonts w:hint="eastAsia"/>
+        </w:rPr>
+        <w:t xml:space="preserve">RMS，用于衡量该镜片偏离纯刚体的程度。无权、det&gt;0</w:t>
+      </w:r>
+      <w:r>
+        <w:t xml:space="preserve"> </w:t>
+      </w:r>
+      <w:r>
+        <w:rPr>
+          <w:rFonts w:hint="eastAsia"/>
+        </w:rPr>
+        <w:t xml:space="preserve">时有闭式</w:t>
+      </w:r>
+      <w:r>
+        <w:t xml:space="preserve"> </w:t>
+      </w:r>
+      <w:r>
+        <w:rPr>
+          <w:rStyle w:val="VerbatimChar"/>
+        </w:rPr>
+        <w:t xml:space="preserve">Σ‖eᵢ‖² = Σ(‖Pᵢ‖²+‖Qᵢ‖²) − 2(σ₁+σ₂+σ₃)</w:t>
+      </w:r>
+      <w:r>
+        <w:rPr>
+          <w:rFonts w:hint="eastAsia"/>
+        </w:rPr>
+        <w:t xml:space="preserve">。残差越大，说明面形变化越显著、单一刚体位移/旋转越不足以描述真实变形——此时应考虑面形传递（STAR</w:t>
       </w:r>
       <w:r>
         <w:t xml:space="preserve"> / </w:t>
@@ -2163,6 +2763,40 @@
           <w:rFonts w:hint="eastAsia"/>
         </w:rPr>
         <w:t xml:space="preserve">Zernike，当前版本不含）。</w:t>
+      </w:r>
+    </w:p>
+    <w:p>
+      <w:pPr>
+        <w:pStyle w:val="BlockText"/>
+      </w:pPr>
+      <w:r>
+        <w:rPr>
+          <w:rFonts w:hint="eastAsia"/>
+        </w:rPr>
+        <w:t xml:space="preserve">退化情形：当镜片节点近似</w:t>
+      </w:r>
+      <w:r>
+        <w:rPr>
+          <w:rFonts w:hint="eastAsia"/>
+          <w:b/>
+          <w:bCs/>
+        </w:rPr>
+        <w:t xml:space="preserve">共线</w:t>
+      </w:r>
+      <w:r>
+        <w:rPr>
+          <w:rFonts w:hint="eastAsia"/>
+        </w:rPr>
+        <w:t xml:space="preserve">时，绕该直线的旋转分量不可观测（σ₃≈σ₂≈0），旋转沿该轴不定；需</w:t>
+      </w:r>
+      <w:r>
+        <w:t xml:space="preserve"> ≥3 </w:t>
+      </w:r>
+      <w:r>
+        <w:rPr>
+          <w:rFonts w:hint="eastAsia"/>
+        </w:rPr>
+        <w:t xml:space="preserve">个非共线节点才能唯一确定三维旋转。</w:t>
       </w:r>
     </w:p>
     <w:p>

</xml_diff>